<commit_message>
Flexpoint POC document updated.
</commit_message>
<xml_diff>
--- a/AWS-Practices/FlexPointWorks/Flexpoint-POC.docx
+++ b/AWS-Practices/FlexPointWorks/Flexpoint-POC.docx
@@ -59,23 +59,187 @@
       </w:r>
       <w:proofErr w:type="spellEnd"/>
       <w:r>
-        <w:t xml:space="preserve"> plan to practice the above project for my learning purpose with free tier plan. Give step by step implementation instructions withe each services explanation, why we need it? Assume this should be as the </w:t>
+        <w:t xml:space="preserve"> plan to practice the above project for my learning purpose with free tier plan. Give step by step implementation instructions with each services explanation, why we need it? Assume this should be as the </w:t>
+      </w:r>
+      <w:r>
+        <w:t>mid-size</w:t>
+      </w:r>
+      <w:r>
+        <w:t xml:space="preserve"> level application around 500 users will use it concurrently from different regions. For </w:t>
+      </w:r>
+      <w:r>
+        <w:t>example,</w:t>
+      </w:r>
+      <w:r>
+        <w:t xml:space="preserve"> one user will be from India, another user will be from UK.</w:t>
+      </w:r>
+    </w:p>
+    <w:p/>
+    <w:p>
+      <w:r>
+        <w:rPr>
+          <w:noProof/>
+        </w:rPr>
+        <w:drawing>
+          <wp:inline distT="0" distB="0" distL="0" distR="0" wp14:anchorId="6E8788AC" wp14:editId="54B4F03D">
+            <wp:extent cx="5731510" cy="3820795"/>
+            <wp:effectExtent l="0" t="0" r="2540" b="8255"/>
+            <wp:docPr id="496289236" name="Picture 1"/>
+            <wp:cNvGraphicFramePr>
+              <a:graphicFrameLocks xmlns:a="http://schemas.openxmlformats.org/drawingml/2006/main" noChangeAspect="1"/>
+            </wp:cNvGraphicFramePr>
+            <a:graphic xmlns:a="http://schemas.openxmlformats.org/drawingml/2006/main">
+              <a:graphicData uri="http://schemas.openxmlformats.org/drawingml/2006/picture">
+                <pic:pic xmlns:pic="http://schemas.openxmlformats.org/drawingml/2006/picture">
+                  <pic:nvPicPr>
+                    <pic:cNvPr id="0" name="Picture 1"/>
+                    <pic:cNvPicPr>
+                      <a:picLocks noChangeAspect="1" noChangeArrowheads="1"/>
+                    </pic:cNvPicPr>
+                  </pic:nvPicPr>
+                  <pic:blipFill>
+                    <a:blip r:embed="rId5" cstate="print">
+                      <a:extLst>
+                        <a:ext uri="{28A0092B-C50C-407E-A947-70E740481C1C}">
+                          <a14:useLocalDpi xmlns:a14="http://schemas.microsoft.com/office/drawing/2010/main" val="0"/>
+                        </a:ext>
+                      </a:extLst>
+                    </a:blip>
+                    <a:srcRect/>
+                    <a:stretch>
+                      <a:fillRect/>
+                    </a:stretch>
+                  </pic:blipFill>
+                  <pic:spPr bwMode="auto">
+                    <a:xfrm>
+                      <a:off x="0" y="0"/>
+                      <a:ext cx="5731510" cy="3820795"/>
+                    </a:xfrm>
+                    <a:prstGeom prst="rect">
+                      <a:avLst/>
+                    </a:prstGeom>
+                    <a:noFill/>
+                    <a:ln>
+                      <a:noFill/>
+                    </a:ln>
+                  </pic:spPr>
+                </pic:pic>
+              </a:graphicData>
+            </a:graphic>
+          </wp:inline>
+        </w:drawing>
+      </w:r>
+    </w:p>
+    <w:p>
+      <w:r>
+        <w:t>Here’s the architecture diagram you asked for — it’s ready now.</w:t>
+      </w:r>
+    </w:p>
+    <w:p>
+      <w:r>
+        <w:t xml:space="preserve">You can see how the </w:t>
       </w:r>
       <w:proofErr w:type="spellStart"/>
       <w:r>
-        <w:t>mid size</w:t>
+        <w:rPr>
+          <w:b/>
+          <w:bCs/>
+        </w:rPr>
+        <w:t>OrderService</w:t>
       </w:r>
       <w:proofErr w:type="spellEnd"/>
       <w:r>
-        <w:t xml:space="preserve"> level application around 500 users will use it concurrently from different regions. For </w:t>
-      </w:r>
-      <w:proofErr w:type="gramStart"/>
-      <w:r>
-        <w:t>example</w:t>
-      </w:r>
-      <w:proofErr w:type="gramEnd"/>
-      <w:r>
-        <w:t xml:space="preserve"> one user will be from India, another user will be from UK.</w:t>
+        <w:t xml:space="preserve"> publishes events, the </w:t>
+      </w:r>
+      <w:proofErr w:type="spellStart"/>
+      <w:r>
+        <w:rPr>
+          <w:b/>
+          <w:bCs/>
+        </w:rPr>
+        <w:t>InvoiceService</w:t>
+      </w:r>
+      <w:proofErr w:type="spellEnd"/>
+      <w:r>
+        <w:t xml:space="preserve"> consumes them and generates invoices, and the </w:t>
+      </w:r>
+      <w:proofErr w:type="spellStart"/>
+      <w:r>
+        <w:rPr>
+          <w:b/>
+          <w:bCs/>
+        </w:rPr>
+        <w:t>SearchService</w:t>
+      </w:r>
+      <w:proofErr w:type="spellEnd"/>
+      <w:r>
+        <w:t xml:space="preserve"> retrieves invoices from RDS/S3 and makes them downloadable.</w:t>
+      </w:r>
+    </w:p>
+    <w:p>
+      <w:r>
+        <w:t>This flow illustrates the microservices interaction for your retail domain app (like Kingfisher):</w:t>
+      </w:r>
+    </w:p>
+    <w:p>
+      <w:pPr>
+        <w:numPr>
+          <w:ilvl w:val="0"/>
+          <w:numId w:val="22"/>
+        </w:numPr>
+      </w:pPr>
+      <w:proofErr w:type="spellStart"/>
+      <w:r>
+        <w:rPr>
+          <w:b/>
+          <w:bCs/>
+        </w:rPr>
+        <w:t>OrderService</w:t>
+      </w:r>
+      <w:proofErr w:type="spellEnd"/>
+      <w:r>
+        <w:t xml:space="preserve"> → RDS + Email + Kafka/RabbitMQ</w:t>
+      </w:r>
+    </w:p>
+    <w:p>
+      <w:pPr>
+        <w:numPr>
+          <w:ilvl w:val="0"/>
+          <w:numId w:val="22"/>
+        </w:numPr>
+      </w:pPr>
+      <w:proofErr w:type="spellStart"/>
+      <w:r>
+        <w:rPr>
+          <w:b/>
+          <w:bCs/>
+        </w:rPr>
+        <w:t>InvoiceService</w:t>
+      </w:r>
+      <w:proofErr w:type="spellEnd"/>
+      <w:r>
+        <w:t xml:space="preserve"> → Event listener + Invoice generator + PDF uploader (S3)</w:t>
+      </w:r>
+    </w:p>
+    <w:p>
+      <w:pPr>
+        <w:numPr>
+          <w:ilvl w:val="0"/>
+          <w:numId w:val="22"/>
+        </w:numPr>
+      </w:pPr>
+      <w:proofErr w:type="spellStart"/>
+      <w:r>
+        <w:rPr>
+          <w:b/>
+          <w:bCs/>
+        </w:rPr>
+        <w:lastRenderedPageBreak/>
+        <w:t>SearchService</w:t>
+      </w:r>
+      <w:proofErr w:type="spellEnd"/>
+      <w:r>
+        <w:t xml:space="preserve"> → Search API + OpenSearch + PDF download from S3</w:t>
       </w:r>
     </w:p>
     <w:p/>
@@ -90,6 +254,7 @@
         <w:rPr>
           <w:b/>
           <w:bCs/>
+          <w:highlight w:val="yellow"/>
         </w:rPr>
         <w:t>Architecture Overview</w:t>
       </w:r>
@@ -254,6 +419,7 @@
         <w:rPr>
           <w:b/>
           <w:bCs/>
+          <w:highlight w:val="yellow"/>
         </w:rPr>
         <w:t>Step-by-Step Implementation</w:t>
       </w:r>
@@ -310,7 +476,7 @@
       <w:r>
         <w:t>Navigate to </w:t>
       </w:r>
-      <w:hyperlink r:id="rId5" w:tgtFrame="_blank" w:history="1">
+      <w:hyperlink r:id="rId6" w:tgtFrame="_blank" w:history="1">
         <w:r>
           <w:rPr>
             <w:rStyle w:val="Hyperlink"/>
@@ -382,7 +548,6 @@
         </w:numPr>
       </w:pPr>
       <w:r>
-        <w:lastRenderedPageBreak/>
         <w:t>Configure route tables</w:t>
       </w:r>
     </w:p>
@@ -423,7 +588,7 @@
       <w:r>
         <w:t>Go to </w:t>
       </w:r>
-      <w:hyperlink r:id="rId6" w:tgtFrame="_blank" w:history="1">
+      <w:hyperlink r:id="rId7" w:tgtFrame="_blank" w:history="1">
         <w:r>
           <w:rPr>
             <w:rStyle w:val="Hyperlink"/>
@@ -451,15 +616,7 @@
         </w:numPr>
       </w:pPr>
       <w:r>
-        <w:t>Instance class: db.t</w:t>
-      </w:r>
-      <w:proofErr w:type="gramStart"/>
-      <w:r>
-        <w:t>3.micro</w:t>
-      </w:r>
-      <w:proofErr w:type="gramEnd"/>
-      <w:r>
-        <w:t xml:space="preserve"> (Free Tier eligible)</w:t>
+        <w:t>Instance class: db.t3.micro (Free Tier eligible)</w:t>
       </w:r>
     </w:p>
     <w:p>
@@ -503,6 +660,7 @@
         </w:numPr>
       </w:pPr>
       <w:r>
+        <w:lastRenderedPageBreak/>
         <w:t>Security group: Allow port 1433 from ECS security group</w:t>
       </w:r>
     </w:p>
@@ -543,7 +701,7 @@
       <w:r>
         <w:t>Access </w:t>
       </w:r>
-      <w:hyperlink r:id="rId7" w:tgtFrame="_blank" w:history="1">
+      <w:hyperlink r:id="rId8" w:tgtFrame="_blank" w:history="1">
         <w:r>
           <w:rPr>
             <w:rStyle w:val="Hyperlink"/>
@@ -712,7 +870,7 @@
       <w:r>
         <w:t>Go to </w:t>
       </w:r>
-      <w:hyperlink r:id="rId8" w:tgtFrame="_blank" w:history="1">
+      <w:hyperlink r:id="rId9" w:tgtFrame="_blank" w:history="1">
         <w:r>
           <w:rPr>
             <w:rStyle w:val="Hyperlink"/>
@@ -740,15 +898,7 @@
         </w:numPr>
       </w:pPr>
       <w:r>
-        <w:t>Instance type: t</w:t>
-      </w:r>
-      <w:proofErr w:type="gramStart"/>
-      <w:r>
-        <w:t>3.small</w:t>
-      </w:r>
-      <w:proofErr w:type="gramEnd"/>
-      <w:r>
-        <w:t>.search (smallest available)</w:t>
+        <w:t>Instance type: t3.small.search (smallest available)</w:t>
       </w:r>
     </w:p>
     <w:p>
@@ -781,7 +931,6 @@
         </w:numPr>
       </w:pPr>
       <w:r>
-        <w:lastRenderedPageBreak/>
         <w:t>VPC deployment in private subnets</w:t>
       </w:r>
     </w:p>
@@ -845,7 +994,7 @@
       <w:r>
         <w:t>Navigate to </w:t>
       </w:r>
-      <w:hyperlink r:id="rId9" w:tgtFrame="_blank" w:history="1">
+      <w:hyperlink r:id="rId10" w:tgtFrame="_blank" w:history="1">
         <w:r>
           <w:rPr>
             <w:rStyle w:val="Hyperlink"/>
@@ -902,6 +1051,7 @@
         </w:numPr>
       </w:pPr>
       <w:r>
+        <w:lastRenderedPageBreak/>
         <w:t>VPC: Use created VPC</w:t>
       </w:r>
     </w:p>
@@ -1030,7 +1180,7 @@
       <w:r>
         <w:t>Go to </w:t>
       </w:r>
-      <w:hyperlink r:id="rId10" w:anchor="LoadBalancers" w:tgtFrame="_blank" w:history="1">
+      <w:hyperlink r:id="rId11" w:anchor="LoadBalancers" w:tgtFrame="_blank" w:history="1">
         <w:r>
           <w:rPr>
             <w:rStyle w:val="Hyperlink"/>
@@ -1146,7 +1296,7 @@
       <w:r>
         <w:t>Access </w:t>
       </w:r>
-      <w:hyperlink r:id="rId11" w:tgtFrame="_blank" w:history="1">
+      <w:hyperlink r:id="rId12" w:tgtFrame="_blank" w:history="1">
         <w:r>
           <w:rPr>
             <w:rStyle w:val="Hyperlink"/>
@@ -1163,7 +1313,6 @@
         </w:numPr>
       </w:pPr>
       <w:r>
-        <w:lastRenderedPageBreak/>
         <w:t>Create distribution:</w:t>
       </w:r>
     </w:p>
@@ -1268,6 +1417,7 @@
           <w:b/>
           <w:bCs/>
         </w:rPr>
+        <w:lastRenderedPageBreak/>
         <w:t>Step 8: Set Up Amazon Cognito</w:t>
       </w:r>
     </w:p>
@@ -1293,7 +1443,7 @@
       <w:r>
         <w:t>Go to </w:t>
       </w:r>
-      <w:hyperlink r:id="rId12" w:tgtFrame="_blank" w:history="1">
+      <w:hyperlink r:id="rId13" w:tgtFrame="_blank" w:history="1">
         <w:r>
           <w:rPr>
             <w:rStyle w:val="Hyperlink"/>
@@ -1405,7 +1555,7 @@
       <w:r>
         <w:t>Navigate to </w:t>
       </w:r>
-      <w:hyperlink r:id="rId13" w:tgtFrame="_blank" w:history="1">
+      <w:hyperlink r:id="rId14" w:tgtFrame="_blank" w:history="1">
         <w:r>
           <w:rPr>
             <w:rStyle w:val="Hyperlink"/>
@@ -1541,7 +1691,6 @@
         </w:numPr>
       </w:pPr>
       <w:r>
-        <w:lastRenderedPageBreak/>
         <w:t>Cognito authentication integration</w:t>
       </w:r>
     </w:p>
@@ -1646,6 +1795,7 @@
         </w:numPr>
       </w:pPr>
       <w:r>
+        <w:lastRenderedPageBreak/>
         <w:t>Health check endpoints</w:t>
       </w:r>
     </w:p>
@@ -1899,7 +2049,6 @@
           <w:b/>
           <w:bCs/>
         </w:rPr>
-        <w:lastRenderedPageBreak/>
         <w:t>Phase 6: Monitoring and Optimization</w:t>
       </w:r>
     </w:p>
@@ -1940,7 +2089,7 @@
       <w:r>
         <w:t>Go to </w:t>
       </w:r>
-      <w:hyperlink r:id="rId14" w:tgtFrame="_blank" w:history="1">
+      <w:hyperlink r:id="rId15" w:tgtFrame="_blank" w:history="1">
         <w:r>
           <w:rPr>
             <w:rStyle w:val="Hyperlink"/>
@@ -2012,6 +2161,7 @@
         </w:numPr>
       </w:pPr>
       <w:r>
+        <w:lastRenderedPageBreak/>
         <w:t>Set up alarms for critical metrics</w:t>
       </w:r>
     </w:p>
@@ -2171,15 +2321,7 @@
         <w:t>RDS</w:t>
       </w:r>
       <w:r>
-        <w:t>: 750 hours of db.t</w:t>
-      </w:r>
-      <w:proofErr w:type="gramStart"/>
-      <w:r>
-        <w:t>3.micro</w:t>
-      </w:r>
-      <w:proofErr w:type="gramEnd"/>
-      <w:r>
-        <w:t>, 20 GB storage</w:t>
+        <w:t>: 750 hours of db.t3.micro, 20 GB storage</w:t>
       </w:r>
     </w:p>
     <w:p>
@@ -2339,154 +2481,154 @@
         </w:numPr>
       </w:pPr>
       <w:r>
+        <w:t>Implement S3 lifecycle policies</w:t>
+      </w:r>
+    </w:p>
+    <w:p>
+      <w:pPr>
+        <w:numPr>
+          <w:ilvl w:val="0"/>
+          <w:numId w:val="20"/>
+        </w:numPr>
+      </w:pPr>
+      <w:r>
+        <w:t>Use CloudFront caching aggressively</w:t>
+      </w:r>
+    </w:p>
+    <w:p>
+      <w:pPr>
+        <w:numPr>
+          <w:ilvl w:val="0"/>
+          <w:numId w:val="20"/>
+        </w:numPr>
+      </w:pPr>
+      <w:r>
+        <w:t>Schedule ECS tasks to scale down during low usage</w:t>
+      </w:r>
+    </w:p>
+    <w:p>
+      <w:pPr>
+        <w:numPr>
+          <w:ilvl w:val="0"/>
+          <w:numId w:val="20"/>
+        </w:numPr>
+      </w:pPr>
+      <w:r>
+        <w:t>Use Reserved Instances for predictable workloads</w:t>
+      </w:r>
+    </w:p>
+    <w:p>
+      <w:pPr>
+        <w:rPr>
+          <w:b/>
+          <w:bCs/>
+        </w:rPr>
+      </w:pPr>
+      <w:r>
+        <w:rPr>
+          <w:b/>
+          <w:bCs/>
+        </w:rPr>
+        <w:t>Regional Deployment Strategy</w:t>
+      </w:r>
+    </w:p>
+    <w:p>
+      <w:r>
+        <w:t>For users in India and UK:</w:t>
+      </w:r>
+    </w:p>
+    <w:p>
+      <w:pPr>
+        <w:numPr>
+          <w:ilvl w:val="0"/>
+          <w:numId w:val="21"/>
+        </w:numPr>
+      </w:pPr>
+      <w:r>
+        <w:t>Deploy primary stack in </w:t>
+      </w:r>
+      <w:r>
+        <w:rPr>
+          <w:b/>
+          <w:bCs/>
+        </w:rPr>
+        <w:t>us-east-1</w:t>
+      </w:r>
+      <w:r>
+        <w:t> (lowest cost)</w:t>
+      </w:r>
+    </w:p>
+    <w:p>
+      <w:pPr>
+        <w:numPr>
+          <w:ilvl w:val="0"/>
+          <w:numId w:val="21"/>
+        </w:numPr>
+      </w:pPr>
+      <w:r>
+        <w:t>Use </w:t>
+      </w:r>
+      <w:r>
+        <w:rPr>
+          <w:b/>
+          <w:bCs/>
+        </w:rPr>
+        <w:t>CloudFront</w:t>
+      </w:r>
+      <w:r>
+        <w:t> for global content delivery</w:t>
+      </w:r>
+    </w:p>
+    <w:p>
+      <w:pPr>
+        <w:numPr>
+          <w:ilvl w:val="0"/>
+          <w:numId w:val="21"/>
+        </w:numPr>
+      </w:pPr>
+      <w:r>
+        <w:t>Consider </w:t>
+      </w:r>
+      <w:r>
+        <w:rPr>
+          <w:b/>
+          <w:bCs/>
+        </w:rPr>
+        <w:t>RDS read replicas</w:t>
+      </w:r>
+      <w:r>
+        <w:t> in </w:t>
+      </w:r>
+      <w:r>
+        <w:rPr>
+          <w:b/>
+          <w:bCs/>
+        </w:rPr>
+        <w:t>eu-west-1</w:t>
+      </w:r>
+      <w:r>
+        <w:t> and </w:t>
+      </w:r>
+      <w:r>
+        <w:rPr>
+          <w:b/>
+          <w:bCs/>
+        </w:rPr>
+        <w:t>ap-south-1</w:t>
+      </w:r>
+      <w:r>
+        <w:t> for read-heavy workloads</w:t>
+      </w:r>
+    </w:p>
+    <w:p>
+      <w:pPr>
+        <w:numPr>
+          <w:ilvl w:val="0"/>
+          <w:numId w:val="21"/>
+        </w:numPr>
+      </w:pPr>
+      <w:r>
         <w:lastRenderedPageBreak/>
-        <w:t>Implement S3 lifecycle policies</w:t>
-      </w:r>
-    </w:p>
-    <w:p>
-      <w:pPr>
-        <w:numPr>
-          <w:ilvl w:val="0"/>
-          <w:numId w:val="20"/>
-        </w:numPr>
-      </w:pPr>
-      <w:r>
-        <w:t>Use CloudFront caching aggressively</w:t>
-      </w:r>
-    </w:p>
-    <w:p>
-      <w:pPr>
-        <w:numPr>
-          <w:ilvl w:val="0"/>
-          <w:numId w:val="20"/>
-        </w:numPr>
-      </w:pPr>
-      <w:r>
-        <w:t>Schedule ECS tasks to scale down during low usage</w:t>
-      </w:r>
-    </w:p>
-    <w:p>
-      <w:pPr>
-        <w:numPr>
-          <w:ilvl w:val="0"/>
-          <w:numId w:val="20"/>
-        </w:numPr>
-      </w:pPr>
-      <w:r>
-        <w:t>Use Reserved Instances for predictable workloads</w:t>
-      </w:r>
-    </w:p>
-    <w:p>
-      <w:pPr>
-        <w:rPr>
-          <w:b/>
-          <w:bCs/>
-        </w:rPr>
-      </w:pPr>
-      <w:r>
-        <w:rPr>
-          <w:b/>
-          <w:bCs/>
-        </w:rPr>
-        <w:t>Regional Deployment Strategy</w:t>
-      </w:r>
-    </w:p>
-    <w:p>
-      <w:r>
-        <w:t>For users in India and UK:</w:t>
-      </w:r>
-    </w:p>
-    <w:p>
-      <w:pPr>
-        <w:numPr>
-          <w:ilvl w:val="0"/>
-          <w:numId w:val="21"/>
-        </w:numPr>
-      </w:pPr>
-      <w:r>
-        <w:t>Deploy primary stack in </w:t>
-      </w:r>
-      <w:r>
-        <w:rPr>
-          <w:b/>
-          <w:bCs/>
-        </w:rPr>
-        <w:t>us-east-1</w:t>
-      </w:r>
-      <w:r>
-        <w:t> (lowest cost)</w:t>
-      </w:r>
-    </w:p>
-    <w:p>
-      <w:pPr>
-        <w:numPr>
-          <w:ilvl w:val="0"/>
-          <w:numId w:val="21"/>
-        </w:numPr>
-      </w:pPr>
-      <w:r>
-        <w:t>Use </w:t>
-      </w:r>
-      <w:r>
-        <w:rPr>
-          <w:b/>
-          <w:bCs/>
-        </w:rPr>
-        <w:t>CloudFront</w:t>
-      </w:r>
-      <w:r>
-        <w:t> for global content delivery</w:t>
-      </w:r>
-    </w:p>
-    <w:p>
-      <w:pPr>
-        <w:numPr>
-          <w:ilvl w:val="0"/>
-          <w:numId w:val="21"/>
-        </w:numPr>
-      </w:pPr>
-      <w:r>
-        <w:t>Consider </w:t>
-      </w:r>
-      <w:r>
-        <w:rPr>
-          <w:b/>
-          <w:bCs/>
-        </w:rPr>
-        <w:t>RDS read replicas</w:t>
-      </w:r>
-      <w:r>
-        <w:t> in </w:t>
-      </w:r>
-      <w:r>
-        <w:rPr>
-          <w:b/>
-          <w:bCs/>
-        </w:rPr>
-        <w:t>eu-west-1</w:t>
-      </w:r>
-      <w:r>
-        <w:t> and </w:t>
-      </w:r>
-      <w:r>
-        <w:rPr>
-          <w:b/>
-          <w:bCs/>
-        </w:rPr>
-        <w:t>ap-south-1</w:t>
-      </w:r>
-      <w:r>
-        <w:t> for read-heavy workloads</w:t>
-      </w:r>
-    </w:p>
-    <w:p>
-      <w:pPr>
-        <w:numPr>
-          <w:ilvl w:val="0"/>
-          <w:numId w:val="21"/>
-        </w:numPr>
-      </w:pPr>
-      <w:r>
         <w:t>Implement </w:t>
       </w:r>
       <w:r>
@@ -2522,7 +2664,7 @@
       </w:r>
     </w:p>
     <w:p>
-      <w:hyperlink r:id="rId15" w:tgtFrame="_blank" w:history="1">
+      <w:hyperlink r:id="rId16" w:tgtFrame="_blank" w:history="1">
         <w:r>
           <w:rPr>
             <w:rStyle w:val="Hyperlink"/>
@@ -2530,7 +2672,6 @@
           <w:t xml:space="preserve">Cost effective AWS OpenSearch service for development | AWS </w:t>
         </w:r>
         <w:proofErr w:type="spellStart"/>
-        <w:proofErr w:type="gramStart"/>
         <w:r>
           <w:rPr>
             <w:rStyle w:val="Hyperlink"/>
@@ -2538,7 +2679,6 @@
           <w:t>re:Post</w:t>
         </w:r>
         <w:proofErr w:type="spellEnd"/>
-        <w:proofErr w:type="gramEnd"/>
         <w:r>
           <w:rPr>
             <w:rStyle w:val="Hyperlink"/>
@@ -2548,7 +2688,7 @@
       </w:hyperlink>
     </w:p>
     <w:p>
-      <w:hyperlink r:id="rId16" w:tgtFrame="_blank" w:history="1">
+      <w:hyperlink r:id="rId17" w:tgtFrame="_blank" w:history="1">
         <w:r>
           <w:rPr>
             <w:rStyle w:val="Hyperlink"/>
@@ -2558,7 +2698,7 @@
       </w:hyperlink>
     </w:p>
     <w:p>
-      <w:hyperlink r:id="rId17" w:tgtFrame="_blank" w:history="1">
+      <w:hyperlink r:id="rId18" w:tgtFrame="_blank" w:history="1">
         <w:r>
           <w:rPr>
             <w:rStyle w:val="Hyperlink"/>
@@ -2568,7 +2708,7 @@
       </w:hyperlink>
     </w:p>
     <w:p>
-      <w:hyperlink r:id="rId18" w:tgtFrame="_blank" w:history="1">
+      <w:hyperlink r:id="rId19" w:tgtFrame="_blank" w:history="1">
         <w:r>
           <w:rPr>
             <w:rStyle w:val="Hyperlink"/>
@@ -2578,7 +2718,7 @@
       </w:hyperlink>
     </w:p>
     <w:p>
-      <w:hyperlink r:id="rId19" w:tgtFrame="_blank" w:history="1">
+      <w:hyperlink r:id="rId20" w:tgtFrame="_blank" w:history="1">
         <w:r>
           <w:rPr>
             <w:rStyle w:val="Hyperlink"/>
@@ -2588,7 +2728,7 @@
       </w:hyperlink>
     </w:p>
     <w:p>
-      <w:hyperlink r:id="rId20" w:tgtFrame="_blank" w:history="1">
+      <w:hyperlink r:id="rId21" w:tgtFrame="_blank" w:history="1">
         <w:r>
           <w:rPr>
             <w:rStyle w:val="Hyperlink"/>
@@ -2598,7 +2738,7 @@
       </w:hyperlink>
     </w:p>
     <w:p>
-      <w:hyperlink r:id="rId21" w:tgtFrame="_blank" w:history="1">
+      <w:hyperlink r:id="rId22" w:tgtFrame="_blank" w:history="1">
         <w:r>
           <w:rPr>
             <w:rStyle w:val="Hyperlink"/>
@@ -2608,7 +2748,7 @@
       </w:hyperlink>
     </w:p>
     <w:p>
-      <w:hyperlink r:id="rId22" w:tgtFrame="_blank" w:history="1">
+      <w:hyperlink r:id="rId23" w:tgtFrame="_blank" w:history="1">
         <w:r>
           <w:rPr>
             <w:rStyle w:val="Hyperlink"/>
@@ -2618,7 +2758,7 @@
       </w:hyperlink>
     </w:p>
     <w:p>
-      <w:hyperlink r:id="rId23" w:tgtFrame="_blank" w:history="1">
+      <w:hyperlink r:id="rId24" w:tgtFrame="_blank" w:history="1">
         <w:r>
           <w:rPr>
             <w:rStyle w:val="Hyperlink"/>
@@ -2628,7 +2768,7 @@
       </w:hyperlink>
     </w:p>
     <w:p>
-      <w:hyperlink r:id="rId24" w:tgtFrame="_blank" w:history="1">
+      <w:hyperlink r:id="rId25" w:tgtFrame="_blank" w:history="1">
         <w:r>
           <w:rPr>
             <w:rStyle w:val="Hyperlink"/>
@@ -5002,6 +5142,155 @@
     </w:lvl>
   </w:abstractNum>
   <w:abstractNum w:abstractNumId="19" w15:restartNumberingAfterBreak="0">
+    <w:nsid w:val="720F087B"/>
+    <w:multiLevelType w:val="multilevel"/>
+    <w:tmpl w:val="0012168E"/>
+    <w:lvl w:ilvl="0">
+      <w:start w:val="1"/>
+      <w:numFmt w:val="bullet"/>
+      <w:lvlText w:val=""/>
+      <w:lvlJc w:val="left"/>
+      <w:pPr>
+        <w:tabs>
+          <w:tab w:val="num" w:pos="720"/>
+        </w:tabs>
+        <w:ind w:left="720" w:hanging="360"/>
+      </w:pPr>
+      <w:rPr>
+        <w:rFonts w:ascii="Symbol" w:hAnsi="Symbol" w:hint="default"/>
+        <w:sz w:val="20"/>
+      </w:rPr>
+    </w:lvl>
+    <w:lvl w:ilvl="1" w:tentative="1">
+      <w:start w:val="1"/>
+      <w:numFmt w:val="bullet"/>
+      <w:lvlText w:val="o"/>
+      <w:lvlJc w:val="left"/>
+      <w:pPr>
+        <w:tabs>
+          <w:tab w:val="num" w:pos="1440"/>
+        </w:tabs>
+        <w:ind w:left="1440" w:hanging="360"/>
+      </w:pPr>
+      <w:rPr>
+        <w:rFonts w:ascii="Courier New" w:hAnsi="Courier New" w:hint="default"/>
+        <w:sz w:val="20"/>
+      </w:rPr>
+    </w:lvl>
+    <w:lvl w:ilvl="2" w:tentative="1">
+      <w:start w:val="1"/>
+      <w:numFmt w:val="bullet"/>
+      <w:lvlText w:val=""/>
+      <w:lvlJc w:val="left"/>
+      <w:pPr>
+        <w:tabs>
+          <w:tab w:val="num" w:pos="2160"/>
+        </w:tabs>
+        <w:ind w:left="2160" w:hanging="360"/>
+      </w:pPr>
+      <w:rPr>
+        <w:rFonts w:ascii="Wingdings" w:hAnsi="Wingdings" w:hint="default"/>
+        <w:sz w:val="20"/>
+      </w:rPr>
+    </w:lvl>
+    <w:lvl w:ilvl="3" w:tentative="1">
+      <w:start w:val="1"/>
+      <w:numFmt w:val="bullet"/>
+      <w:lvlText w:val=""/>
+      <w:lvlJc w:val="left"/>
+      <w:pPr>
+        <w:tabs>
+          <w:tab w:val="num" w:pos="2880"/>
+        </w:tabs>
+        <w:ind w:left="2880" w:hanging="360"/>
+      </w:pPr>
+      <w:rPr>
+        <w:rFonts w:ascii="Wingdings" w:hAnsi="Wingdings" w:hint="default"/>
+        <w:sz w:val="20"/>
+      </w:rPr>
+    </w:lvl>
+    <w:lvl w:ilvl="4" w:tentative="1">
+      <w:start w:val="1"/>
+      <w:numFmt w:val="bullet"/>
+      <w:lvlText w:val=""/>
+      <w:lvlJc w:val="left"/>
+      <w:pPr>
+        <w:tabs>
+          <w:tab w:val="num" w:pos="3600"/>
+        </w:tabs>
+        <w:ind w:left="3600" w:hanging="360"/>
+      </w:pPr>
+      <w:rPr>
+        <w:rFonts w:ascii="Wingdings" w:hAnsi="Wingdings" w:hint="default"/>
+        <w:sz w:val="20"/>
+      </w:rPr>
+    </w:lvl>
+    <w:lvl w:ilvl="5" w:tentative="1">
+      <w:start w:val="1"/>
+      <w:numFmt w:val="bullet"/>
+      <w:lvlText w:val=""/>
+      <w:lvlJc w:val="left"/>
+      <w:pPr>
+        <w:tabs>
+          <w:tab w:val="num" w:pos="4320"/>
+        </w:tabs>
+        <w:ind w:left="4320" w:hanging="360"/>
+      </w:pPr>
+      <w:rPr>
+        <w:rFonts w:ascii="Wingdings" w:hAnsi="Wingdings" w:hint="default"/>
+        <w:sz w:val="20"/>
+      </w:rPr>
+    </w:lvl>
+    <w:lvl w:ilvl="6" w:tentative="1">
+      <w:start w:val="1"/>
+      <w:numFmt w:val="bullet"/>
+      <w:lvlText w:val=""/>
+      <w:lvlJc w:val="left"/>
+      <w:pPr>
+        <w:tabs>
+          <w:tab w:val="num" w:pos="5040"/>
+        </w:tabs>
+        <w:ind w:left="5040" w:hanging="360"/>
+      </w:pPr>
+      <w:rPr>
+        <w:rFonts w:ascii="Wingdings" w:hAnsi="Wingdings" w:hint="default"/>
+        <w:sz w:val="20"/>
+      </w:rPr>
+    </w:lvl>
+    <w:lvl w:ilvl="7" w:tentative="1">
+      <w:start w:val="1"/>
+      <w:numFmt w:val="bullet"/>
+      <w:lvlText w:val=""/>
+      <w:lvlJc w:val="left"/>
+      <w:pPr>
+        <w:tabs>
+          <w:tab w:val="num" w:pos="5760"/>
+        </w:tabs>
+        <w:ind w:left="5760" w:hanging="360"/>
+      </w:pPr>
+      <w:rPr>
+        <w:rFonts w:ascii="Wingdings" w:hAnsi="Wingdings" w:hint="default"/>
+        <w:sz w:val="20"/>
+      </w:rPr>
+    </w:lvl>
+    <w:lvl w:ilvl="8" w:tentative="1">
+      <w:start w:val="1"/>
+      <w:numFmt w:val="bullet"/>
+      <w:lvlText w:val=""/>
+      <w:lvlJc w:val="left"/>
+      <w:pPr>
+        <w:tabs>
+          <w:tab w:val="num" w:pos="6480"/>
+        </w:tabs>
+        <w:ind w:left="6480" w:hanging="360"/>
+      </w:pPr>
+      <w:rPr>
+        <w:rFonts w:ascii="Wingdings" w:hAnsi="Wingdings" w:hint="default"/>
+        <w:sz w:val="20"/>
+      </w:rPr>
+    </w:lvl>
+  </w:abstractNum>
+  <w:abstractNum w:abstractNumId="20" w15:restartNumberingAfterBreak="0">
     <w:nsid w:val="73071474"/>
     <w:multiLevelType w:val="multilevel"/>
     <w:tmpl w:val="AF84DDDC"/>
@@ -5114,7 +5403,7 @@
       </w:pPr>
     </w:lvl>
   </w:abstractNum>
-  <w:abstractNum w:abstractNumId="20" w15:restartNumberingAfterBreak="0">
+  <w:abstractNum w:abstractNumId="21" w15:restartNumberingAfterBreak="0">
     <w:nsid w:val="7BEE3A2E"/>
     <w:multiLevelType w:val="multilevel"/>
     <w:tmpl w:val="4DFE8E7C"/>
@@ -5277,7 +5566,7 @@
     <w:abstractNumId w:val="17"/>
   </w:num>
   <w:num w:numId="16" w16cid:durableId="1666088179">
-    <w:abstractNumId w:val="20"/>
+    <w:abstractNumId w:val="21"/>
   </w:num>
   <w:num w:numId="17" w16cid:durableId="1390029103">
     <w:abstractNumId w:val="11"/>
@@ -5289,10 +5578,13 @@
     <w:abstractNumId w:val="14"/>
   </w:num>
   <w:num w:numId="20" w16cid:durableId="1680620717">
-    <w:abstractNumId w:val="19"/>
+    <w:abstractNumId w:val="20"/>
   </w:num>
   <w:num w:numId="21" w16cid:durableId="1640188988">
     <w:abstractNumId w:val="1"/>
+  </w:num>
+  <w:num w:numId="22" w16cid:durableId="1495147060">
+    <w:abstractNumId w:val="19"/>
   </w:num>
 </w:numbering>
 </file>

</xml_diff>